<commit_message>
Completar cotización con datos reales (Villa El Milagro / carta fianza)
- Cotización finalizada: consultor Enrique Huidobro (economista, RUC
  10723712039) a Inversiones Estratégicas Integrales S.A.C., proyecto
  Villa El Milagro (AVN - Techo Propio).
- Reenfoca el sustento de "línea bancaria" a "carta fianza ante
  aseguradoras" en cotización y modelo.
- Honorarios S/ 15,000 por etapas 20/30/50; Recibo por Honorarios con
  suspensión de 4ta (sin IGV ni retención).
- Modelo: portada y etiquetas actualizadas; único pendiente el RUC de
  la empresa.

Co-Authored-By: Claude Opus 4.8 <noreply@anthropic.com>
Claude-Session: https://claude.ai/code/session_01SCxhLGdtCgXmghQV6pgZo9
</commit_message>
<xml_diff>
--- a/entregables/Cotizacion_Servicios_Profesionales.docx
+++ b/entregables/Cotizacion_Servicios_Profesionales.docx
@@ -4,26 +4,24 @@
   <w:body>
     <w:p>
       <w:pPr>
-        <w:pBdr>
-          <w:top w:val="single" w:color="BFBFBF" w:sz="4"/>
-          <w:bottom w:val="single" w:color="BFBFBF" w:sz="4"/>
-          <w:left w:val="single" w:color="BFBFBF" w:sz="4"/>
-          <w:right w:val="single" w:color="BFBFBF" w:sz="4"/>
-        </w:pBdr>
-        <w:shd w:fill="FFF2CC" w:color="auto" w:val="clear"/>
-        <w:spacing w:after="160"/>
+        <w:spacing w:after="20"/>
       </w:pPr>
       <w:r>
         <w:rPr>
           <w:rFonts w:ascii="Calibri" w:cs="Calibri" w:eastAsia="Calibri" w:hAnsi="Calibri"/>
           <w:b/>
           <w:bCs/>
-          <w:color w:val="C00000"/>
-          <w:sz w:val="18"/>
-          <w:szCs w:val="18"/>
-        </w:rPr>
-        <w:t xml:space="preserve">  Instrucciones: </w:t>
-      </w:r>
+          <w:color w:val="1F3864"/>
+          <w:sz w:val="26"/>
+          <w:szCs w:val="26"/>
+        </w:rPr>
+        <w:t xml:space="preserve">ENRIQUE HUIDOBRO</w:t>
+      </w:r>
+    </w:p>
+    <w:p>
+      <w:pPr>
+        <w:spacing w:after="0"/>
+      </w:pPr>
       <w:r>
         <w:rPr>
           <w:rFonts w:ascii="Calibri" w:cs="Calibri" w:eastAsia="Calibri" w:hAnsi="Calibri"/>
@@ -31,19 +29,13 @@
           <w:sz w:val="18"/>
           <w:szCs w:val="18"/>
         </w:rPr>
-        <w:t xml:space="preserve">reemplace los textos en </w:t>
-      </w:r>
-      <w:r>
-        <w:rPr>
-          <w:rFonts w:ascii="Calibri" w:cs="Calibri" w:eastAsia="Calibri" w:hAnsi="Calibri"/>
-          <w:b/>
-          <w:bCs/>
-          <w:color w:val="C00000"/>
-          <w:sz w:val="18"/>
-          <w:szCs w:val="18"/>
-        </w:rPr>
-        <w:t xml:space="preserve">rojo y entre corchetes [ ]</w:t>
-      </w:r>
+        <w:t xml:space="preserve">Economista  ·  Consultor financiero independiente</w:t>
+      </w:r>
+    </w:p>
+    <w:p>
+      <w:pPr>
+        <w:spacing w:after="0"/>
+      </w:pPr>
       <w:r>
         <w:rPr>
           <w:rFonts w:ascii="Calibri" w:cs="Calibri" w:eastAsia="Calibri" w:hAnsi="Calibri"/>
@@ -51,104 +43,7 @@
           <w:sz w:val="18"/>
           <w:szCs w:val="18"/>
         </w:rPr>
-        <w:t xml:space="preserve"> con sus datos reales. Los montos son referenciales y editables.  </w:t>
-      </w:r>
-    </w:p>
-    <w:p>
-      <w:pPr>
-        <w:spacing w:after="20"/>
-        <w:jc w:val="left"/>
-      </w:pPr>
-      <w:r>
-        <w:rPr>
-          <w:rFonts w:ascii="Calibri" w:cs="Calibri" w:eastAsia="Calibri" w:hAnsi="Calibri"/>
-          <w:b/>
-          <w:bCs/>
-          <w:color w:val="C00000"/>
-        </w:rPr>
-        <w:t xml:space="preserve">[TU NOMBRE COMPLETO]</w:t>
-      </w:r>
-    </w:p>
-    <w:p>
-      <w:pPr>
-        <w:spacing w:after="0"/>
-      </w:pPr>
-      <w:r>
-        <w:rPr>
-          <w:rFonts w:ascii="Calibri" w:cs="Calibri" w:eastAsia="Calibri" w:hAnsi="Calibri"/>
-          <w:color w:val="808080"/>
-          <w:sz w:val="18"/>
-          <w:szCs w:val="18"/>
-        </w:rPr>
-        <w:t xml:space="preserve">Consultor(a) independiente – </w:t>
-      </w:r>
-      <w:r>
-        <w:rPr>
-          <w:rFonts w:ascii="Calibri" w:cs="Calibri" w:eastAsia="Calibri" w:hAnsi="Calibri"/>
-          <w:b/>
-          <w:bCs/>
-          <w:color w:val="C00000"/>
-        </w:rPr>
-        <w:t xml:space="preserve">[Profesión / Especialidad]</w:t>
-      </w:r>
-    </w:p>
-    <w:p>
-      <w:pPr>
-        <w:spacing w:after="0"/>
-      </w:pPr>
-      <w:r>
-        <w:rPr>
-          <w:rFonts w:ascii="Calibri" w:cs="Calibri" w:eastAsia="Calibri" w:hAnsi="Calibri"/>
-          <w:color w:val="808080"/>
-          <w:sz w:val="18"/>
-          <w:szCs w:val="18"/>
-        </w:rPr>
-        <w:t xml:space="preserve">RUC / DNI: </w:t>
-      </w:r>
-      <w:r>
-        <w:rPr>
-          <w:rFonts w:ascii="Calibri" w:cs="Calibri" w:eastAsia="Calibri" w:hAnsi="Calibri"/>
-          <w:b/>
-          <w:bCs/>
-          <w:color w:val="C00000"/>
-        </w:rPr>
-        <w:t xml:space="preserve">[N° RUC o DNI]</w:t>
-      </w:r>
-      <w:r>
-        <w:rPr>
-          <w:rFonts w:ascii="Calibri" w:cs="Calibri" w:eastAsia="Calibri" w:hAnsi="Calibri"/>
-          <w:color w:val="808080"/>
-          <w:sz w:val="18"/>
-          <w:szCs w:val="18"/>
-        </w:rPr>
-        <w:t xml:space="preserve">   ·   Tel: </w:t>
-      </w:r>
-      <w:r>
-        <w:rPr>
-          <w:rFonts w:ascii="Calibri" w:cs="Calibri" w:eastAsia="Calibri" w:hAnsi="Calibri"/>
-          <w:b/>
-          <w:bCs/>
-          <w:color w:val="C00000"/>
-        </w:rPr>
-        <w:t xml:space="preserve">[teléfono]</w:t>
-      </w:r>
-      <w:r>
-        <w:rPr>
-          <w:rFonts w:ascii="Calibri" w:cs="Calibri" w:eastAsia="Calibri" w:hAnsi="Calibri"/>
-          <w:color w:val="808080"/>
-          <w:sz w:val="18"/>
-          <w:szCs w:val="18"/>
-        </w:rPr>
-        <w:t xml:space="preserve">   ·   Email: </w:t>
-      </w:r>
-      <w:r>
-        <w:rPr>
-          <w:rFonts w:ascii="Calibri" w:cs="Calibri" w:eastAsia="Calibri" w:hAnsi="Calibri"/>
-          <w:b/>
-          <w:bCs/>
-          <w:color w:val="C00000"/>
-        </w:rPr>
-        <w:t xml:space="preserve">[correo]</w:t>
+        <w:t xml:space="preserve">RUC: 10723712039   ·   Tel: 974 293 131   ·   Email: chicoma.1998@gmail.com</w:t>
       </w:r>
     </w:p>
     <w:p>
@@ -192,54 +87,13 @@
           <w:rFonts w:ascii="Calibri" w:cs="Calibri" w:eastAsia="Calibri" w:hAnsi="Calibri"/>
           <w:color w:val="808080"/>
         </w:rPr>
-        <w:t xml:space="preserve">N° </w:t>
-      </w:r>
-      <w:r>
-        <w:rPr>
-          <w:rFonts w:ascii="Calibri" w:cs="Calibri" w:eastAsia="Calibri" w:hAnsi="Calibri"/>
-          <w:b/>
-          <w:bCs/>
-          <w:color w:val="C00000"/>
-        </w:rPr>
-        <w:t xml:space="preserve">[COT-2026-001]</w:t>
-      </w:r>
-      <w:r>
-        <w:rPr>
-          <w:rFonts w:ascii="Calibri" w:cs="Calibri" w:eastAsia="Calibri" w:hAnsi="Calibri"/>
-          <w:color w:val="808080"/>
-        </w:rPr>
-        <w:t xml:space="preserve">        Fecha: </w:t>
-      </w:r>
-      <w:r>
-        <w:rPr>
-          <w:rFonts w:ascii="Calibri" w:cs="Calibri" w:eastAsia="Calibri" w:hAnsi="Calibri"/>
-          <w:b/>
-          <w:bCs/>
-          <w:color w:val="C00000"/>
-        </w:rPr>
-        <w:t xml:space="preserve">[dd/mm/aaaa]</w:t>
-      </w:r>
-      <w:r>
-        <w:rPr>
-          <w:rFonts w:ascii="Calibri" w:cs="Calibri" w:eastAsia="Calibri" w:hAnsi="Calibri"/>
-          <w:color w:val="808080"/>
-        </w:rPr>
-        <w:t xml:space="preserve">        Ciudad: </w:t>
-      </w:r>
-      <w:r>
-        <w:rPr>
-          <w:rFonts w:ascii="Calibri" w:cs="Calibri" w:eastAsia="Calibri" w:hAnsi="Calibri"/>
-          <w:b/>
-          <w:bCs/>
-          <w:color w:val="C00000"/>
-        </w:rPr>
-        <w:t xml:space="preserve">[Lima]</w:t>
+        <w:t xml:space="preserve">N° COT-2026-001        Fecha: 31/07/2026        Lima</w:t>
       </w:r>
     </w:p>
     <w:p>
       <w:pPr>
         <w:pStyle w:val="Heading2"/>
-        <w:spacing w:after="100" w:before="220"/>
+        <w:spacing w:after="100" w:before="120"/>
       </w:pPr>
       <w:r>
         <w:rPr>
@@ -315,11 +169,70 @@
             <w:r>
               <w:rPr>
                 <w:rFonts w:ascii="Calibri" w:cs="Calibri" w:eastAsia="Calibri" w:hAnsi="Calibri"/>
+                <w:b w:val="false"/>
+                <w:bCs w:val="false"/>
+                <w:color w:val="000000"/>
+                <w:sz w:val="20"/>
+                <w:szCs w:val="20"/>
+              </w:rPr>
+              <w:t xml:space="preserve">INVERSIONES ESTRATÉGICAS INTEGRALES S.A.C.</w:t>
+            </w:r>
+          </w:p>
+        </w:tc>
+      </w:tr>
+      <w:tr>
+        <w:tc>
+          <w:tcPr>
+            <w:tcW w:type="dxa" w:w="2600"/>
+            <w:shd w:fill="D9E1F2" w:color="auto" w:val="clear"/>
+            <w:tcMar>
+              <w:top w:type="dxa" w:w="60"/>
+              <w:left w:type="dxa" w:w="100"/>
+              <w:bottom w:type="dxa" w:w="60"/>
+              <w:right w:type="dxa" w:w="100"/>
+            </w:tcMar>
+            <w:vAlign w:val="center"/>
+          </w:tcPr>
+          <w:p>
+            <w:pPr>
+              <w:jc w:val="left"/>
+            </w:pPr>
+            <w:r>
+              <w:rPr>
+                <w:rFonts w:ascii="Calibri" w:cs="Calibri" w:eastAsia="Calibri" w:hAnsi="Calibri"/>
+                <w:b/>
+                <w:bCs/>
+                <w:color w:val="000000"/>
+                <w:sz w:val="20"/>
+                <w:szCs w:val="20"/>
+              </w:rPr>
+              <w:t xml:space="preserve">RUC</w:t>
+            </w:r>
+          </w:p>
+        </w:tc>
+        <w:tc>
+          <w:tcPr>
+            <w:tcW w:type="dxa" w:w="6760"/>
+            <w:tcMar>
+              <w:top w:type="dxa" w:w="60"/>
+              <w:left w:type="dxa" w:w="100"/>
+              <w:bottom w:type="dxa" w:w="60"/>
+              <w:right w:type="dxa" w:w="100"/>
+            </w:tcMar>
+            <w:vAlign w:val="center"/>
+          </w:tcPr>
+          <w:p>
+            <w:pPr>
+              <w:jc w:val="left"/>
+            </w:pPr>
+            <w:r>
+              <w:rPr>
+                <w:rFonts w:ascii="Calibri" w:cs="Calibri" w:eastAsia="Calibri" w:hAnsi="Calibri"/>
                 <w:b/>
                 <w:bCs/>
                 <w:color w:val="C00000"/>
               </w:rPr>
-              <w:t xml:space="preserve">[RAZÓN SOCIAL DE LA EMPRESA DESARROLLADORA S.A.C.]</w:t>
+              <w:t xml:space="preserve">[N° RUC de la empresa]</w:t>
             </w:r>
           </w:p>
         </w:tc>
@@ -350,13 +263,44 @@
                 <w:sz w:val="20"/>
                 <w:szCs w:val="20"/>
               </w:rPr>
-              <w:t xml:space="preserve">RUC</w:t>
+              <w:t xml:space="preserve">Atención</w:t>
             </w:r>
           </w:p>
         </w:tc>
         <w:tc>
           <w:tcPr>
             <w:tcW w:type="dxa" w:w="6760"/>
+            <w:tcMar>
+              <w:top w:type="dxa" w:w="60"/>
+              <w:left w:type="dxa" w:w="100"/>
+              <w:bottom w:type="dxa" w:w="60"/>
+              <w:right w:type="dxa" w:w="100"/>
+            </w:tcMar>
+            <w:vAlign w:val="center"/>
+          </w:tcPr>
+          <w:p>
+            <w:pPr>
+              <w:jc w:val="left"/>
+            </w:pPr>
+            <w:r>
+              <w:rPr>
+                <w:rFonts w:ascii="Calibri" w:cs="Calibri" w:eastAsia="Calibri" w:hAnsi="Calibri"/>
+                <w:b w:val="false"/>
+                <w:bCs w:val="false"/>
+                <w:color w:val="000000"/>
+                <w:sz w:val="20"/>
+                <w:szCs w:val="20"/>
+              </w:rPr>
+              <w:t xml:space="preserve">Sr. José Antonio Navarro Merea – Gerente General (Tel. 998 107 048)</w:t>
+            </w:r>
+          </w:p>
+        </w:tc>
+      </w:tr>
+      <w:tr>
+        <w:tc>
+          <w:tcPr>
+            <w:tcW w:type="dxa" w:w="2600"/>
+            <w:shd w:fill="D9E1F2" w:color="auto" w:val="clear"/>
             <w:tcMar>
               <w:top w:type="dxa" w:w="60"/>
               <w:left w:type="dxa" w:w="100"/>
@@ -374,18 +318,17 @@
                 <w:rFonts w:ascii="Calibri" w:cs="Calibri" w:eastAsia="Calibri" w:hAnsi="Calibri"/>
                 <w:b/>
                 <w:bCs/>
-                <w:color w:val="C00000"/>
-              </w:rPr>
-              <w:t xml:space="preserve">[N° RUC de la empresa]</w:t>
-            </w:r>
-          </w:p>
-        </w:tc>
-      </w:tr>
-      <w:tr>
-        <w:tc>
-          <w:tcPr>
-            <w:tcW w:type="dxa" w:w="2600"/>
-            <w:shd w:fill="D9E1F2" w:color="auto" w:val="clear"/>
+                <w:color w:val="000000"/>
+                <w:sz w:val="20"/>
+                <w:szCs w:val="20"/>
+              </w:rPr>
+              <w:t xml:space="preserve">Proyecto</w:t>
+            </w:r>
+          </w:p>
+        </w:tc>
+        <w:tc>
+          <w:tcPr>
+            <w:tcW w:type="dxa" w:w="6760"/>
             <w:tcMar>
               <w:top w:type="dxa" w:w="60"/>
               <w:left w:type="dxa" w:w="100"/>
@@ -401,96 +344,13 @@
             <w:r>
               <w:rPr>
                 <w:rFonts w:ascii="Calibri" w:cs="Calibri" w:eastAsia="Calibri" w:hAnsi="Calibri"/>
-                <w:b/>
-                <w:bCs/>
-                <w:color w:val="000000"/>
-                <w:sz w:val="20"/>
-                <w:szCs w:val="20"/>
-              </w:rPr>
-              <w:t xml:space="preserve">Atención</w:t>
-            </w:r>
-          </w:p>
-        </w:tc>
-        <w:tc>
-          <w:tcPr>
-            <w:tcW w:type="dxa" w:w="6760"/>
-            <w:tcMar>
-              <w:top w:type="dxa" w:w="60"/>
-              <w:left w:type="dxa" w:w="100"/>
-              <w:bottom w:type="dxa" w:w="60"/>
-              <w:right w:type="dxa" w:w="100"/>
-            </w:tcMar>
-            <w:vAlign w:val="center"/>
-          </w:tcPr>
-          <w:p>
-            <w:pPr>
-              <w:jc w:val="left"/>
-            </w:pPr>
-            <w:r>
-              <w:rPr>
-                <w:rFonts w:ascii="Calibri" w:cs="Calibri" w:eastAsia="Calibri" w:hAnsi="Calibri"/>
-                <w:b/>
-                <w:bCs/>
-                <w:color w:val="C00000"/>
-              </w:rPr>
-              <w:t xml:space="preserve">[Nombre – cargo, p. ej. Gerente General]</w:t>
-            </w:r>
-          </w:p>
-        </w:tc>
-      </w:tr>
-      <w:tr>
-        <w:tc>
-          <w:tcPr>
-            <w:tcW w:type="dxa" w:w="2600"/>
-            <w:shd w:fill="D9E1F2" w:color="auto" w:val="clear"/>
-            <w:tcMar>
-              <w:top w:type="dxa" w:w="60"/>
-              <w:left w:type="dxa" w:w="100"/>
-              <w:bottom w:type="dxa" w:w="60"/>
-              <w:right w:type="dxa" w:w="100"/>
-            </w:tcMar>
-            <w:vAlign w:val="center"/>
-          </w:tcPr>
-          <w:p>
-            <w:pPr>
-              <w:jc w:val="left"/>
-            </w:pPr>
-            <w:r>
-              <w:rPr>
-                <w:rFonts w:ascii="Calibri" w:cs="Calibri" w:eastAsia="Calibri" w:hAnsi="Calibri"/>
-                <w:b/>
-                <w:bCs/>
-                <w:color w:val="000000"/>
-                <w:sz w:val="20"/>
-                <w:szCs w:val="20"/>
-              </w:rPr>
-              <w:t xml:space="preserve">Proyecto</w:t>
-            </w:r>
-          </w:p>
-        </w:tc>
-        <w:tc>
-          <w:tcPr>
-            <w:tcW w:type="dxa" w:w="6760"/>
-            <w:tcMar>
-              <w:top w:type="dxa" w:w="60"/>
-              <w:left w:type="dxa" w:w="100"/>
-              <w:bottom w:type="dxa" w:w="60"/>
-              <w:right w:type="dxa" w:w="100"/>
-            </w:tcMar>
-            <w:vAlign w:val="center"/>
-          </w:tcPr>
-          <w:p>
-            <w:pPr>
-              <w:jc w:val="left"/>
-            </w:pPr>
-            <w:r>
-              <w:rPr>
-                <w:rFonts w:ascii="Calibri" w:cs="Calibri" w:eastAsia="Calibri" w:hAnsi="Calibri"/>
-                <w:b/>
-                <w:bCs/>
-                <w:color w:val="C00000"/>
-              </w:rPr>
-              <w:t xml:space="preserve">[Nombre del proyecto inmobiliario]</w:t>
+                <w:b w:val="false"/>
+                <w:bCs w:val="false"/>
+                <w:color w:val="000000"/>
+                <w:sz w:val="20"/>
+                <w:szCs w:val="20"/>
+              </w:rPr>
+              <w:t xml:space="preserve">VILLA EL MILAGRO – Adquisición de Vivienda Nueva (AVN), Programa Techo Propio</w:t>
             </w:r>
           </w:p>
         </w:tc>
@@ -524,13 +384,41 @@
         <w:rPr>
           <w:rFonts w:ascii="Calibri" w:cs="Calibri" w:eastAsia="Calibri" w:hAnsi="Calibri"/>
         </w:rPr>
-        <w:t xml:space="preserve">Elaboración de flujo de caja, cronograma valorizado y estado de resultados proyectado del proyecto, para sustento de la línea de financiamiento ante la entidad bancaria.</w:t>
+        <w:t xml:space="preserve">Elaboración del flujo de caja, cronograma valorizado y estado de resultados proyectado del proyecto de vivienda </w:t>
+      </w:r>
+      <w:r>
+        <w:rPr>
+          <w:rFonts w:ascii="Calibri" w:cs="Calibri" w:eastAsia="Calibri" w:hAnsi="Calibri"/>
+          <w:b/>
+          <w:bCs/>
+        </w:rPr>
+        <w:t xml:space="preserve">VILLA EL MILAGRO</w:t>
+      </w:r>
+      <w:r>
+        <w:rPr>
+          <w:rFonts w:ascii="Calibri" w:cs="Calibri" w:eastAsia="Calibri" w:hAnsi="Calibri"/>
+        </w:rPr>
+        <w:t xml:space="preserve"> (modalidad AVN – Programa Techo Propio), como sustento técnico-financiero para la obtención de una </w:t>
+      </w:r>
+      <w:r>
+        <w:rPr>
+          <w:rFonts w:ascii="Calibri" w:cs="Calibri" w:eastAsia="Calibri" w:hAnsi="Calibri"/>
+          <w:b/>
+          <w:bCs/>
+        </w:rPr>
+        <w:t xml:space="preserve">carta fianza ante empresas aseguradoras</w:t>
+      </w:r>
+      <w:r>
+        <w:rPr>
+          <w:rFonts w:ascii="Calibri" w:cs="Calibri" w:eastAsia="Calibri" w:hAnsi="Calibri"/>
+        </w:rPr>
+        <w:t xml:space="preserve">.</w:t>
       </w:r>
     </w:p>
     <w:p>
       <w:pPr>
         <w:pStyle w:val="Heading1"/>
-        <w:spacing w:after="100" w:before="220"/>
+        <w:spacing w:after="100" w:before="240"/>
       </w:pPr>
       <w:r>
         <w:rPr>
@@ -570,36 +458,34 @@
           <w:rFonts w:ascii="Calibri" w:cs="Calibri" w:eastAsia="Calibri" w:hAnsi="Calibri"/>
           <w:b/>
           <w:bCs/>
-          <w:color w:val="C00000"/>
-        </w:rPr>
-        <w:t xml:space="preserve">[nombre del proyecto]</w:t>
-      </w:r>
-      <w:r>
-        <w:rPr>
-          <w:rFonts w:ascii="Calibri" w:cs="Calibri" w:eastAsia="Calibri" w:hAnsi="Calibri"/>
-        </w:rPr>
-        <w:t xml:space="preserve">, con el objetivo de sustentar técnicamente la solicitud de una línea de financiamiento ante </w:t>
+        </w:rPr>
+        <w:t xml:space="preserve">VILLA EL MILAGRO</w:t>
+      </w:r>
+      <w:r>
+        <w:rPr>
+          <w:rFonts w:ascii="Calibri" w:cs="Calibri" w:eastAsia="Calibri" w:hAnsi="Calibri"/>
+        </w:rPr>
+        <w:t xml:space="preserve"> (modalidad Adquisición de Vivienda Nueva – AVN del Programa Techo Propio), con el objetivo de sustentar técnicamente la solicitud de una </w:t>
       </w:r>
       <w:r>
         <w:rPr>
           <w:rFonts w:ascii="Calibri" w:cs="Calibri" w:eastAsia="Calibri" w:hAnsi="Calibri"/>
           <w:b/>
           <w:bCs/>
-          <w:color w:val="C00000"/>
-        </w:rPr>
-        <w:t xml:space="preserve">[nombre del banco]</w:t>
-      </w:r>
-      <w:r>
-        <w:rPr>
-          <w:rFonts w:ascii="Calibri" w:cs="Calibri" w:eastAsia="Calibri" w:hAnsi="Calibri"/>
-        </w:rPr>
-        <w:t xml:space="preserve">. Los entregables han sido diseñados conforme a los requisitos habituales que las áreas de riesgos y negocios inmobiliarios de la banca solicitan para la evaluación crediticia de proyectos de este tipo.</w:t>
+        </w:rPr>
+        <w:t xml:space="preserve">carta fianza ante empresas aseguradoras</w:t>
+      </w:r>
+      <w:r>
+        <w:rPr>
+          <w:rFonts w:ascii="Calibri" w:cs="Calibri" w:eastAsia="Calibri" w:hAnsi="Calibri"/>
+        </w:rPr>
+        <w:t xml:space="preserve">, requerida para el desarrollo y la garantía del proyecto. Los entregables han sido diseñados conforme a la información que las áreas de riesgos y suscripción de las aseguradoras evalúan para la emisión de este tipo de garantías.</w:t>
       </w:r>
     </w:p>
     <w:p>
       <w:pPr>
         <w:pStyle w:val="Heading1"/>
-        <w:spacing w:after="100" w:before="220"/>
+        <w:spacing w:after="100" w:before="240"/>
       </w:pPr>
       <w:r>
         <w:rPr>
@@ -620,13 +506,13 @@
         <w:rPr>
           <w:rFonts w:ascii="Calibri" w:cs="Calibri" w:eastAsia="Calibri" w:hAnsi="Calibri"/>
         </w:rPr>
-        <w:t xml:space="preserve">Proveer a la empresa desarrolladora de un modelo financiero integral y de la documentación de sustento necesaria para presentar el proyecto al banco y gestionar los desembolsos asociados al avance de obra.</w:t>
+        <w:t xml:space="preserve">Proveer a la empresa de un modelo financiero integral y de la documentación de sustento necesaria para gestionar la carta fianza ante la aseguradora, respaldando la viabilidad del proyecto y su capacidad de cumplimiento.</w:t>
       </w:r>
     </w:p>
     <w:p>
       <w:pPr>
         <w:pStyle w:val="Heading1"/>
-        <w:spacing w:after="100" w:before="220"/>
+        <w:spacing w:after="100" w:before="240"/>
       </w:pPr>
       <w:r>
         <w:rPr>
@@ -653,14 +539,14 @@
     <w:p>
       <w:pPr>
         <w:pStyle w:val="Heading2"/>
-        <w:spacing w:after="100" w:before="220"/>
+        <w:spacing w:after="60" w:before="140"/>
       </w:pPr>
       <w:r>
         <w:rPr>
           <w:rFonts w:ascii="Calibri" w:cs="Calibri" w:eastAsia="Calibri" w:hAnsi="Calibri"/>
           <w:b/>
           <w:bCs/>
-          <w:color w:val="1F3864"/>
+          <w:color w:val="2E5496"/>
         </w:rPr>
         <w:t xml:space="preserve">3.1  Flujo de caja del proyecto</w:t>
       </w:r>
@@ -696,7 +582,7 @@
         <w:rPr>
           <w:rFonts w:ascii="Calibri" w:cs="Calibri" w:eastAsia="Calibri" w:hAnsi="Calibri"/>
         </w:rPr>
-        <w:t xml:space="preserve">Ingresos por cuota inicial de clientes (preventas), desembolsos de la línea bancaria y cobro de saldos vía créditos hipotecarios.</w:t>
+        <w:t xml:space="preserve">Ingresos por ventas —Bono Familiar Habitacional (Techo Propio), ahorro del beneficiario y crédito complementario, según corresponda— y por los desembolsos asociados al financiamiento del proyecto.</w:t>
       </w:r>
     </w:p>
     <w:p>
@@ -736,14 +622,14 @@
     <w:p>
       <w:pPr>
         <w:pStyle w:val="Heading2"/>
-        <w:spacing w:after="100" w:before="220"/>
+        <w:spacing w:after="60" w:before="140"/>
       </w:pPr>
       <w:r>
         <w:rPr>
           <w:rFonts w:ascii="Calibri" w:cs="Calibri" w:eastAsia="Calibri" w:hAnsi="Calibri"/>
           <w:b/>
           <w:bCs/>
-          <w:color w:val="1F3864"/>
+          <w:color w:val="2E5496"/>
         </w:rPr>
         <w:t xml:space="preserve">3.2  Cronograma valorizado de obra</w:t>
       </w:r>
@@ -779,7 +665,7 @@
         <w:rPr>
           <w:rFonts w:ascii="Calibri" w:cs="Calibri" w:eastAsia="Calibri" w:hAnsi="Calibri"/>
         </w:rPr>
-        <w:t xml:space="preserve">Determinación del calendario de desembolsos bancarios atados a las valorizaciones, base para las solicitudes de desembolso ante el banco.</w:t>
+        <w:t xml:space="preserve">Determinación del calendario de desembolsos y del dimensionamiento de la carta fianza en función del avance del proyecto.</w:t>
       </w:r>
     </w:p>
     <w:p>
@@ -802,14 +688,14 @@
     <w:p>
       <w:pPr>
         <w:pStyle w:val="Heading2"/>
-        <w:spacing w:after="100" w:before="220"/>
+        <w:spacing w:after="60" w:before="140"/>
       </w:pPr>
       <w:r>
         <w:rPr>
           <w:rFonts w:ascii="Calibri" w:cs="Calibri" w:eastAsia="Calibri" w:hAnsi="Calibri"/>
           <w:b/>
           <w:bCs/>
-          <w:color w:val="1F3864"/>
+          <w:color w:val="2E5496"/>
         </w:rPr>
         <w:t xml:space="preserve">3.3  Estado de resultados proyectado</w:t>
       </w:r>
@@ -851,16 +737,16 @@
     <w:p>
       <w:pPr>
         <w:pStyle w:val="Heading2"/>
-        <w:spacing w:after="100" w:before="220"/>
+        <w:spacing w:after="60" w:before="140"/>
       </w:pPr>
       <w:r>
         <w:rPr>
           <w:rFonts w:ascii="Calibri" w:cs="Calibri" w:eastAsia="Calibri" w:hAnsi="Calibri"/>
           <w:b/>
           <w:bCs/>
-          <w:color w:val="1F3864"/>
-        </w:rPr>
-        <w:t xml:space="preserve">3.4  Informe / memoria de sustento para el banco</w:t>
+          <w:color w:val="2E5496"/>
+        </w:rPr>
+        <w:t xml:space="preserve">3.4  Informe / memoria de sustento para la aseguradora</w:t>
       </w:r>
     </w:p>
     <w:p>
@@ -894,13 +780,13 @@
         <w:rPr>
           <w:rFonts w:ascii="Calibri" w:cs="Calibri" w:eastAsia="Calibri" w:hAnsi="Calibri"/>
         </w:rPr>
-        <w:t xml:space="preserve">Análisis de sensibilidad básico y conclusiones sobre la viabilidad y capacidad de repago del proyecto.</w:t>
+        <w:t xml:space="preserve">Análisis de sensibilidad básico y conclusiones sobre la viabilidad y la capacidad de cumplimiento del proyecto, orientado a la entidad emisora de la carta fianza.</w:t>
       </w:r>
     </w:p>
     <w:p>
       <w:pPr>
         <w:pStyle w:val="Heading1"/>
-        <w:spacing w:after="100" w:before="220"/>
+        <w:spacing w:after="100" w:before="240"/>
       </w:pPr>
       <w:r>
         <w:rPr>
@@ -977,13 +863,13 @@
         <w:rPr>
           <w:rFonts w:ascii="Calibri" w:cs="Calibri" w:eastAsia="Calibri" w:hAnsi="Calibri"/>
         </w:rPr>
-        <w:t xml:space="preserve">Entrega final de los modelos e informe, con acompañamiento para su presentación al banco.</w:t>
+        <w:t xml:space="preserve">Entrega final de los modelos e informe, con acompañamiento para su presentación ante la aseguradora.</w:t>
       </w:r>
     </w:p>
     <w:p>
       <w:pPr>
         <w:pStyle w:val="Heading1"/>
-        <w:spacing w:after="100" w:before="220"/>
+        <w:spacing w:after="100" w:before="240"/>
       </w:pPr>
       <w:r>
         <w:rPr>
@@ -1415,7 +1301,7 @@
                 <w:sz w:val="20"/>
                 <w:szCs w:val="20"/>
               </w:rPr>
-              <w:t xml:space="preserve">Informe / memoria de sustento para el banco</w:t>
+              <w:t xml:space="preserve">Informe / memoria de sustento para la aseguradora</w:t>
             </w:r>
           </w:p>
         </w:tc>
@@ -1464,7 +1350,7 @@
     <w:p>
       <w:pPr>
         <w:pStyle w:val="Heading1"/>
-        <w:spacing w:after="100" w:before="220"/>
+        <w:spacing w:after="100" w:before="240"/>
       </w:pPr>
       <w:r>
         <w:rPr>
@@ -1492,15 +1378,8 @@
           <w:rFonts w:ascii="Calibri" w:cs="Calibri" w:eastAsia="Calibri" w:hAnsi="Calibri"/>
           <w:b/>
           <w:bCs/>
-          <w:color w:val="C00000"/>
-        </w:rPr>
-        <w:t xml:space="preserve">[15]</w:t>
-      </w:r>
-      <w:r>
-        <w:rPr>
-          <w:rFonts w:ascii="Calibri" w:cs="Calibri" w:eastAsia="Calibri" w:hAnsi="Calibri"/>
-        </w:rPr>
-        <w:t xml:space="preserve"> días calendario</w:t>
+        </w:rPr>
+        <w:t xml:space="preserve">15 días calendario</w:t>
       </w:r>
       <w:r>
         <w:rPr>
@@ -1635,11 +1514,13 @@
             <w:r>
               <w:rPr>
                 <w:rFonts w:ascii="Calibri" w:cs="Calibri" w:eastAsia="Calibri" w:hAnsi="Calibri"/>
-                <w:b/>
-                <w:bCs/>
-                <w:color w:val="C00000"/>
-              </w:rPr>
-              <w:t xml:space="preserve">[3] días</w:t>
+                <w:b w:val="false"/>
+                <w:bCs w:val="false"/>
+                <w:color w:val="000000"/>
+                <w:sz w:val="20"/>
+                <w:szCs w:val="20"/>
+              </w:rPr>
+              <w:t xml:space="preserve">3 días</w:t>
             </w:r>
           </w:p>
         </w:tc>
@@ -1691,11 +1572,13 @@
             <w:r>
               <w:rPr>
                 <w:rFonts w:ascii="Calibri" w:cs="Calibri" w:eastAsia="Calibri" w:hAnsi="Calibri"/>
-                <w:b/>
-                <w:bCs/>
-                <w:color w:val="C00000"/>
-              </w:rPr>
-              <w:t xml:space="preserve">[7] días</w:t>
+                <w:b w:val="false"/>
+                <w:bCs w:val="false"/>
+                <w:color w:val="000000"/>
+                <w:sz w:val="20"/>
+                <w:szCs w:val="20"/>
+              </w:rPr>
+              <w:t xml:space="preserve">10 días</w:t>
             </w:r>
           </w:p>
         </w:tc>
@@ -1747,11 +1630,13 @@
             <w:r>
               <w:rPr>
                 <w:rFonts w:ascii="Calibri" w:cs="Calibri" w:eastAsia="Calibri" w:hAnsi="Calibri"/>
-                <w:b/>
-                <w:bCs/>
-                <w:color w:val="C00000"/>
-              </w:rPr>
-              <w:t xml:space="preserve">[5] días</w:t>
+                <w:b w:val="false"/>
+                <w:bCs w:val="false"/>
+                <w:color w:val="000000"/>
+                <w:sz w:val="20"/>
+                <w:szCs w:val="20"/>
+              </w:rPr>
+              <w:t xml:space="preserve">5 días</w:t>
             </w:r>
           </w:p>
         </w:tc>
@@ -1772,7 +1657,7 @@
     <w:p>
       <w:pPr>
         <w:pStyle w:val="Heading1"/>
-        <w:spacing w:after="100" w:before="220"/>
+        <w:spacing w:after="100" w:before="240"/>
       </w:pPr>
       <w:r>
         <w:rPr>
@@ -1801,22 +1686,13 @@
           <w:b/>
           <w:bCs/>
         </w:rPr>
-        <w:t xml:space="preserve">S/ </w:t>
-      </w:r>
-      <w:r>
-        <w:rPr>
-          <w:rFonts w:ascii="Calibri" w:cs="Calibri" w:eastAsia="Calibri" w:hAnsi="Calibri"/>
-          <w:b/>
-          <w:bCs/>
-          <w:color w:val="C00000"/>
-        </w:rPr>
-        <w:t xml:space="preserve">[15,000.00]</w:t>
-      </w:r>
-      <w:r>
-        <w:rPr>
-          <w:rFonts w:ascii="Calibri" w:cs="Calibri" w:eastAsia="Calibri" w:hAnsi="Calibri"/>
-        </w:rPr>
-        <w:t xml:space="preserve"> (más impuestos según corresponda), pagaderos </w:t>
+        <w:t xml:space="preserve">S/ 15,000.00</w:t>
+      </w:r>
+      <w:r>
+        <w:rPr>
+          <w:rFonts w:ascii="Calibri" w:cs="Calibri" w:eastAsia="Calibri" w:hAnsi="Calibri"/>
+        </w:rPr>
+        <w:t xml:space="preserve"> (quince mil y 00/100 soles), pagaderos </w:t>
       </w:r>
       <w:r>
         <w:rPr>
@@ -1846,10 +1722,9 @@
         </w:tblBorders>
       </w:tblPr>
       <w:tblGrid>
-        <w:gridCol w:w="4260"/>
-        <w:gridCol w:w="1500"/>
-        <w:gridCol w:w="1800"/>
-        <w:gridCol w:w="1800"/>
+        <w:gridCol w:w="5460"/>
+        <w:gridCol w:w="1300"/>
+        <w:gridCol w:w="2600"/>
       </w:tblGrid>
       <w:tr>
         <w:trPr>
@@ -1857,7 +1732,7 @@
         </w:trPr>
         <w:tc>
           <w:tcPr>
-            <w:tcW w:type="dxa" w:w="4260"/>
+            <w:tcW w:type="dxa" w:w="5460"/>
             <w:shd w:fill="1F3864" w:color="auto" w:val="clear"/>
             <w:tcMar>
               <w:top w:type="dxa" w:w="60"/>
@@ -1886,7 +1761,7 @@
         </w:tc>
         <w:tc>
           <w:tcPr>
-            <w:tcW w:type="dxa" w:w="1500"/>
+            <w:tcW w:type="dxa" w:w="1300"/>
             <w:shd w:fill="1F3864" w:color="auto" w:val="clear"/>
             <w:tcMar>
               <w:top w:type="dxa" w:w="60"/>
@@ -1915,7 +1790,7 @@
         </w:tc>
         <w:tc>
           <w:tcPr>
-            <w:tcW w:type="dxa" w:w="1800"/>
+            <w:tcW w:type="dxa" w:w="2600"/>
             <w:shd w:fill="1F3864" w:color="auto" w:val="clear"/>
             <w:tcMar>
               <w:top w:type="dxa" w:w="60"/>
@@ -1938,13 +1813,273 @@
                 <w:sz w:val="20"/>
                 <w:szCs w:val="20"/>
               </w:rPr>
-              <w:t xml:space="preserve">Subtotal (S/)</w:t>
-            </w:r>
-          </w:p>
-        </w:tc>
-        <w:tc>
-          <w:tcPr>
-            <w:tcW w:type="dxa" w:w="1800"/>
+              <w:t xml:space="preserve">Importe (S/)</w:t>
+            </w:r>
+          </w:p>
+        </w:tc>
+      </w:tr>
+      <w:tr>
+        <w:tc>
+          <w:tcPr>
+            <w:tcW w:type="dxa" w:w="5460"/>
+            <w:tcMar>
+              <w:top w:type="dxa" w:w="60"/>
+              <w:left w:type="dxa" w:w="100"/>
+              <w:bottom w:type="dxa" w:w="60"/>
+              <w:right w:type="dxa" w:w="100"/>
+            </w:tcMar>
+            <w:vAlign w:val="center"/>
+          </w:tcPr>
+          <w:p>
+            <w:pPr>
+              <w:jc w:val="left"/>
+            </w:pPr>
+            <w:r>
+              <w:rPr>
+                <w:rFonts w:ascii="Calibri" w:cs="Calibri" w:eastAsia="Calibri" w:hAnsi="Calibri"/>
+                <w:b w:val="false"/>
+                <w:bCs w:val="false"/>
+                <w:color w:val="000000"/>
+                <w:sz w:val="20"/>
+                <w:szCs w:val="20"/>
+              </w:rPr>
+              <w:t xml:space="preserve">Adelanto (a la firma de la propuesta)</w:t>
+            </w:r>
+          </w:p>
+        </w:tc>
+        <w:tc>
+          <w:tcPr>
+            <w:tcW w:type="dxa" w:w="1300"/>
+            <w:tcMar>
+              <w:top w:type="dxa" w:w="60"/>
+              <w:left w:type="dxa" w:w="100"/>
+              <w:bottom w:type="dxa" w:w="60"/>
+              <w:right w:type="dxa" w:w="100"/>
+            </w:tcMar>
+            <w:vAlign w:val="center"/>
+          </w:tcPr>
+          <w:p>
+            <w:pPr>
+              <w:jc w:val="center"/>
+            </w:pPr>
+            <w:r>
+              <w:rPr>
+                <w:rFonts w:ascii="Calibri" w:cs="Calibri" w:eastAsia="Calibri" w:hAnsi="Calibri"/>
+                <w:b w:val="false"/>
+                <w:bCs w:val="false"/>
+                <w:color w:val="000000"/>
+                <w:sz w:val="20"/>
+                <w:szCs w:val="20"/>
+              </w:rPr>
+              <w:t xml:space="preserve">20%</w:t>
+            </w:r>
+          </w:p>
+        </w:tc>
+        <w:tc>
+          <w:tcPr>
+            <w:tcW w:type="dxa" w:w="2600"/>
+            <w:tcMar>
+              <w:top w:type="dxa" w:w="60"/>
+              <w:left w:type="dxa" w:w="100"/>
+              <w:bottom w:type="dxa" w:w="60"/>
+              <w:right w:type="dxa" w:w="100"/>
+            </w:tcMar>
+            <w:vAlign w:val="center"/>
+          </w:tcPr>
+          <w:p>
+            <w:pPr>
+              <w:jc w:val="right"/>
+            </w:pPr>
+            <w:r>
+              <w:rPr>
+                <w:rFonts w:ascii="Calibri" w:cs="Calibri" w:eastAsia="Calibri" w:hAnsi="Calibri"/>
+                <w:b w:val="false"/>
+                <w:bCs w:val="false"/>
+                <w:color w:val="000000"/>
+                <w:sz w:val="20"/>
+                <w:szCs w:val="20"/>
+              </w:rPr>
+              <w:t xml:space="preserve">3,000.00</w:t>
+            </w:r>
+          </w:p>
+        </w:tc>
+      </w:tr>
+      <w:tr>
+        <w:tc>
+          <w:tcPr>
+            <w:tcW w:type="dxa" w:w="5460"/>
+            <w:tcMar>
+              <w:top w:type="dxa" w:w="60"/>
+              <w:left w:type="dxa" w:w="100"/>
+              <w:bottom w:type="dxa" w:w="60"/>
+              <w:right w:type="dxa" w:w="100"/>
+            </w:tcMar>
+            <w:vAlign w:val="center"/>
+          </w:tcPr>
+          <w:p>
+            <w:pPr>
+              <w:jc w:val="left"/>
+            </w:pPr>
+            <w:r>
+              <w:rPr>
+                <w:rFonts w:ascii="Calibri" w:cs="Calibri" w:eastAsia="Calibri" w:hAnsi="Calibri"/>
+                <w:b w:val="false"/>
+                <w:bCs w:val="false"/>
+                <w:color w:val="000000"/>
+                <w:sz w:val="20"/>
+                <w:szCs w:val="20"/>
+              </w:rPr>
+              <w:t xml:space="preserve">Entrega del borrador para revisión</w:t>
+            </w:r>
+          </w:p>
+        </w:tc>
+        <w:tc>
+          <w:tcPr>
+            <w:tcW w:type="dxa" w:w="1300"/>
+            <w:tcMar>
+              <w:top w:type="dxa" w:w="60"/>
+              <w:left w:type="dxa" w:w="100"/>
+              <w:bottom w:type="dxa" w:w="60"/>
+              <w:right w:type="dxa" w:w="100"/>
+            </w:tcMar>
+            <w:vAlign w:val="center"/>
+          </w:tcPr>
+          <w:p>
+            <w:pPr>
+              <w:jc w:val="center"/>
+            </w:pPr>
+            <w:r>
+              <w:rPr>
+                <w:rFonts w:ascii="Calibri" w:cs="Calibri" w:eastAsia="Calibri" w:hAnsi="Calibri"/>
+                <w:b w:val="false"/>
+                <w:bCs w:val="false"/>
+                <w:color w:val="000000"/>
+                <w:sz w:val="20"/>
+                <w:szCs w:val="20"/>
+              </w:rPr>
+              <w:t xml:space="preserve">30%</w:t>
+            </w:r>
+          </w:p>
+        </w:tc>
+        <w:tc>
+          <w:tcPr>
+            <w:tcW w:type="dxa" w:w="2600"/>
+            <w:tcMar>
+              <w:top w:type="dxa" w:w="60"/>
+              <w:left w:type="dxa" w:w="100"/>
+              <w:bottom w:type="dxa" w:w="60"/>
+              <w:right w:type="dxa" w:w="100"/>
+            </w:tcMar>
+            <w:vAlign w:val="center"/>
+          </w:tcPr>
+          <w:p>
+            <w:pPr>
+              <w:jc w:val="right"/>
+            </w:pPr>
+            <w:r>
+              <w:rPr>
+                <w:rFonts w:ascii="Calibri" w:cs="Calibri" w:eastAsia="Calibri" w:hAnsi="Calibri"/>
+                <w:b w:val="false"/>
+                <w:bCs w:val="false"/>
+                <w:color w:val="000000"/>
+                <w:sz w:val="20"/>
+                <w:szCs w:val="20"/>
+              </w:rPr>
+              <w:t xml:space="preserve">4,500.00</w:t>
+            </w:r>
+          </w:p>
+        </w:tc>
+      </w:tr>
+      <w:tr>
+        <w:tc>
+          <w:tcPr>
+            <w:tcW w:type="dxa" w:w="5460"/>
+            <w:tcMar>
+              <w:top w:type="dxa" w:w="60"/>
+              <w:left w:type="dxa" w:w="100"/>
+              <w:bottom w:type="dxa" w:w="60"/>
+              <w:right w:type="dxa" w:w="100"/>
+            </w:tcMar>
+            <w:vAlign w:val="center"/>
+          </w:tcPr>
+          <w:p>
+            <w:pPr>
+              <w:jc w:val="left"/>
+            </w:pPr>
+            <w:r>
+              <w:rPr>
+                <w:rFonts w:ascii="Calibri" w:cs="Calibri" w:eastAsia="Calibri" w:hAnsi="Calibri"/>
+                <w:b w:val="false"/>
+                <w:bCs w:val="false"/>
+                <w:color w:val="000000"/>
+                <w:sz w:val="20"/>
+                <w:szCs w:val="20"/>
+              </w:rPr>
+              <w:t xml:space="preserve">Entrega final aprobada</w:t>
+            </w:r>
+          </w:p>
+        </w:tc>
+        <w:tc>
+          <w:tcPr>
+            <w:tcW w:type="dxa" w:w="1300"/>
+            <w:tcMar>
+              <w:top w:type="dxa" w:w="60"/>
+              <w:left w:type="dxa" w:w="100"/>
+              <w:bottom w:type="dxa" w:w="60"/>
+              <w:right w:type="dxa" w:w="100"/>
+            </w:tcMar>
+            <w:vAlign w:val="center"/>
+          </w:tcPr>
+          <w:p>
+            <w:pPr>
+              <w:jc w:val="center"/>
+            </w:pPr>
+            <w:r>
+              <w:rPr>
+                <w:rFonts w:ascii="Calibri" w:cs="Calibri" w:eastAsia="Calibri" w:hAnsi="Calibri"/>
+                <w:b w:val="false"/>
+                <w:bCs w:val="false"/>
+                <w:color w:val="000000"/>
+                <w:sz w:val="20"/>
+                <w:szCs w:val="20"/>
+              </w:rPr>
+              <w:t xml:space="preserve">50%</w:t>
+            </w:r>
+          </w:p>
+        </w:tc>
+        <w:tc>
+          <w:tcPr>
+            <w:tcW w:type="dxa" w:w="2600"/>
+            <w:tcMar>
+              <w:top w:type="dxa" w:w="60"/>
+              <w:left w:type="dxa" w:w="100"/>
+              <w:bottom w:type="dxa" w:w="60"/>
+              <w:right w:type="dxa" w:w="100"/>
+            </w:tcMar>
+            <w:vAlign w:val="center"/>
+          </w:tcPr>
+          <w:p>
+            <w:pPr>
+              <w:jc w:val="right"/>
+            </w:pPr>
+            <w:r>
+              <w:rPr>
+                <w:rFonts w:ascii="Calibri" w:cs="Calibri" w:eastAsia="Calibri" w:hAnsi="Calibri"/>
+                <w:b w:val="false"/>
+                <w:bCs w:val="false"/>
+                <w:color w:val="000000"/>
+                <w:sz w:val="20"/>
+                <w:szCs w:val="20"/>
+              </w:rPr>
+              <w:t xml:space="preserve">7,500.00</w:t>
+            </w:r>
+          </w:p>
+        </w:tc>
+      </w:tr>
+      <w:tr>
+        <w:tc>
+          <w:tcPr>
+            <w:tcW w:type="dxa" w:w="5460"/>
             <w:shd w:fill="1F3864" w:color="auto" w:val="clear"/>
             <w:tcMar>
               <w:top w:type="dxa" w:w="60"/>
@@ -1956,7 +2091,7 @@
           </w:tcPr>
           <w:p>
             <w:pPr>
-              <w:jc w:val="right"/>
+              <w:jc w:val="left"/>
             </w:pPr>
             <w:r>
               <w:rPr>
@@ -1967,43 +2102,14 @@
                 <w:sz w:val="20"/>
                 <w:szCs w:val="20"/>
               </w:rPr>
-              <w:t xml:space="preserve">IGV 18% (S/)</w:t>
-            </w:r>
-          </w:p>
-        </w:tc>
-      </w:tr>
-      <w:tr>
-        <w:tc>
-          <w:tcPr>
-            <w:tcW w:type="dxa" w:w="4260"/>
-            <w:tcMar>
-              <w:top w:type="dxa" w:w="60"/>
-              <w:left w:type="dxa" w:w="100"/>
-              <w:bottom w:type="dxa" w:w="60"/>
-              <w:right w:type="dxa" w:w="100"/>
-            </w:tcMar>
-            <w:vAlign w:val="center"/>
-          </w:tcPr>
-          <w:p>
-            <w:pPr>
-              <w:jc w:val="left"/>
-            </w:pPr>
-            <w:r>
-              <w:rPr>
-                <w:rFonts w:ascii="Calibri" w:cs="Calibri" w:eastAsia="Calibri" w:hAnsi="Calibri"/>
-                <w:b w:val="false"/>
-                <w:bCs w:val="false"/>
-                <w:color w:val="000000"/>
-                <w:sz w:val="20"/>
-                <w:szCs w:val="20"/>
-              </w:rPr>
-              <w:t xml:space="preserve">Adelanto (a la firma de la propuesta)</w:t>
-            </w:r>
-          </w:p>
-        </w:tc>
-        <w:tc>
-          <w:tcPr>
-            <w:tcW w:type="dxa" w:w="1500"/>
+              <w:t xml:space="preserve">TOTAL</w:t>
+            </w:r>
+          </w:p>
+        </w:tc>
+        <w:tc>
+          <w:tcPr>
+            <w:tcW w:type="dxa" w:w="1300"/>
+            <w:shd w:fill="1F3864" w:color="auto" w:val="clear"/>
             <w:tcMar>
               <w:top w:type="dxa" w:w="60"/>
               <w:left w:type="dxa" w:w="100"/>
@@ -2015,423 +2121,6 @@
           <w:p>
             <w:pPr>
               <w:jc w:val="center"/>
-            </w:pPr>
-            <w:r>
-              <w:rPr>
-                <w:rFonts w:ascii="Calibri" w:cs="Calibri" w:eastAsia="Calibri" w:hAnsi="Calibri"/>
-                <w:b w:val="false"/>
-                <w:bCs w:val="false"/>
-                <w:color w:val="000000"/>
-                <w:sz w:val="20"/>
-                <w:szCs w:val="20"/>
-              </w:rPr>
-              <w:t xml:space="preserve">40%</w:t>
-            </w:r>
-          </w:p>
-        </w:tc>
-        <w:tc>
-          <w:tcPr>
-            <w:tcW w:type="dxa" w:w="1800"/>
-            <w:tcMar>
-              <w:top w:type="dxa" w:w="60"/>
-              <w:left w:type="dxa" w:w="100"/>
-              <w:bottom w:type="dxa" w:w="60"/>
-              <w:right w:type="dxa" w:w="100"/>
-            </w:tcMar>
-            <w:vAlign w:val="center"/>
-          </w:tcPr>
-          <w:p>
-            <w:pPr>
-              <w:jc w:val="right"/>
-            </w:pPr>
-            <w:r>
-              <w:rPr>
-                <w:rFonts w:ascii="Calibri" w:cs="Calibri" w:eastAsia="Calibri" w:hAnsi="Calibri"/>
-                <w:b/>
-                <w:bCs/>
-                <w:color w:val="C00000"/>
-              </w:rPr>
-              <w:t xml:space="preserve">[6,000.00]</w:t>
-            </w:r>
-          </w:p>
-        </w:tc>
-        <w:tc>
-          <w:tcPr>
-            <w:tcW w:type="dxa" w:w="1800"/>
-            <w:tcMar>
-              <w:top w:type="dxa" w:w="60"/>
-              <w:left w:type="dxa" w:w="100"/>
-              <w:bottom w:type="dxa" w:w="60"/>
-              <w:right w:type="dxa" w:w="100"/>
-            </w:tcMar>
-            <w:vAlign w:val="center"/>
-          </w:tcPr>
-          <w:p>
-            <w:pPr>
-              <w:jc w:val="right"/>
-            </w:pPr>
-            <w:r>
-              <w:rPr>
-                <w:rFonts w:ascii="Calibri" w:cs="Calibri" w:eastAsia="Calibri" w:hAnsi="Calibri"/>
-                <w:b/>
-                <w:bCs/>
-                <w:color w:val="C00000"/>
-              </w:rPr>
-              <w:t xml:space="preserve">[1,080.00]</w:t>
-            </w:r>
-          </w:p>
-        </w:tc>
-      </w:tr>
-      <w:tr>
-        <w:tc>
-          <w:tcPr>
-            <w:tcW w:type="dxa" w:w="4260"/>
-            <w:tcMar>
-              <w:top w:type="dxa" w:w="60"/>
-              <w:left w:type="dxa" w:w="100"/>
-              <w:bottom w:type="dxa" w:w="60"/>
-              <w:right w:type="dxa" w:w="100"/>
-            </w:tcMar>
-            <w:vAlign w:val="center"/>
-          </w:tcPr>
-          <w:p>
-            <w:pPr>
-              <w:jc w:val="left"/>
-            </w:pPr>
-            <w:r>
-              <w:rPr>
-                <w:rFonts w:ascii="Calibri" w:cs="Calibri" w:eastAsia="Calibri" w:hAnsi="Calibri"/>
-                <w:b w:val="false"/>
-                <w:bCs w:val="false"/>
-                <w:color w:val="000000"/>
-                <w:sz w:val="20"/>
-                <w:szCs w:val="20"/>
-              </w:rPr>
-              <w:t xml:space="preserve">Entrega del borrador para revisión</w:t>
-            </w:r>
-          </w:p>
-        </w:tc>
-        <w:tc>
-          <w:tcPr>
-            <w:tcW w:type="dxa" w:w="1500"/>
-            <w:tcMar>
-              <w:top w:type="dxa" w:w="60"/>
-              <w:left w:type="dxa" w:w="100"/>
-              <w:bottom w:type="dxa" w:w="60"/>
-              <w:right w:type="dxa" w:w="100"/>
-            </w:tcMar>
-            <w:vAlign w:val="center"/>
-          </w:tcPr>
-          <w:p>
-            <w:pPr>
-              <w:jc w:val="center"/>
-            </w:pPr>
-            <w:r>
-              <w:rPr>
-                <w:rFonts w:ascii="Calibri" w:cs="Calibri" w:eastAsia="Calibri" w:hAnsi="Calibri"/>
-                <w:b w:val="false"/>
-                <w:bCs w:val="false"/>
-                <w:color w:val="000000"/>
-                <w:sz w:val="20"/>
-                <w:szCs w:val="20"/>
-              </w:rPr>
-              <w:t xml:space="preserve">30%</w:t>
-            </w:r>
-          </w:p>
-        </w:tc>
-        <w:tc>
-          <w:tcPr>
-            <w:tcW w:type="dxa" w:w="1800"/>
-            <w:tcMar>
-              <w:top w:type="dxa" w:w="60"/>
-              <w:left w:type="dxa" w:w="100"/>
-              <w:bottom w:type="dxa" w:w="60"/>
-              <w:right w:type="dxa" w:w="100"/>
-            </w:tcMar>
-            <w:vAlign w:val="center"/>
-          </w:tcPr>
-          <w:p>
-            <w:pPr>
-              <w:jc w:val="right"/>
-            </w:pPr>
-            <w:r>
-              <w:rPr>
-                <w:rFonts w:ascii="Calibri" w:cs="Calibri" w:eastAsia="Calibri" w:hAnsi="Calibri"/>
-                <w:b/>
-                <w:bCs/>
-                <w:color w:val="C00000"/>
-              </w:rPr>
-              <w:t xml:space="preserve">[4,500.00]</w:t>
-            </w:r>
-          </w:p>
-        </w:tc>
-        <w:tc>
-          <w:tcPr>
-            <w:tcW w:type="dxa" w:w="1800"/>
-            <w:tcMar>
-              <w:top w:type="dxa" w:w="60"/>
-              <w:left w:type="dxa" w:w="100"/>
-              <w:bottom w:type="dxa" w:w="60"/>
-              <w:right w:type="dxa" w:w="100"/>
-            </w:tcMar>
-            <w:vAlign w:val="center"/>
-          </w:tcPr>
-          <w:p>
-            <w:pPr>
-              <w:jc w:val="right"/>
-            </w:pPr>
-            <w:r>
-              <w:rPr>
-                <w:rFonts w:ascii="Calibri" w:cs="Calibri" w:eastAsia="Calibri" w:hAnsi="Calibri"/>
-                <w:b/>
-                <w:bCs/>
-                <w:color w:val="C00000"/>
-              </w:rPr>
-              <w:t xml:space="preserve">[810.00]</w:t>
-            </w:r>
-          </w:p>
-        </w:tc>
-      </w:tr>
-      <w:tr>
-        <w:tc>
-          <w:tcPr>
-            <w:tcW w:type="dxa" w:w="4260"/>
-            <w:tcMar>
-              <w:top w:type="dxa" w:w="60"/>
-              <w:left w:type="dxa" w:w="100"/>
-              <w:bottom w:type="dxa" w:w="60"/>
-              <w:right w:type="dxa" w:w="100"/>
-            </w:tcMar>
-            <w:vAlign w:val="center"/>
-          </w:tcPr>
-          <w:p>
-            <w:pPr>
-              <w:jc w:val="left"/>
-            </w:pPr>
-            <w:r>
-              <w:rPr>
-                <w:rFonts w:ascii="Calibri" w:cs="Calibri" w:eastAsia="Calibri" w:hAnsi="Calibri"/>
-                <w:b w:val="false"/>
-                <w:bCs w:val="false"/>
-                <w:color w:val="000000"/>
-                <w:sz w:val="20"/>
-                <w:szCs w:val="20"/>
-              </w:rPr>
-              <w:t xml:space="preserve">Entrega final aprobada</w:t>
-            </w:r>
-          </w:p>
-        </w:tc>
-        <w:tc>
-          <w:tcPr>
-            <w:tcW w:type="dxa" w:w="1500"/>
-            <w:tcMar>
-              <w:top w:type="dxa" w:w="60"/>
-              <w:left w:type="dxa" w:w="100"/>
-              <w:bottom w:type="dxa" w:w="60"/>
-              <w:right w:type="dxa" w:w="100"/>
-            </w:tcMar>
-            <w:vAlign w:val="center"/>
-          </w:tcPr>
-          <w:p>
-            <w:pPr>
-              <w:jc w:val="center"/>
-            </w:pPr>
-            <w:r>
-              <w:rPr>
-                <w:rFonts w:ascii="Calibri" w:cs="Calibri" w:eastAsia="Calibri" w:hAnsi="Calibri"/>
-                <w:b w:val="false"/>
-                <w:bCs w:val="false"/>
-                <w:color w:val="000000"/>
-                <w:sz w:val="20"/>
-                <w:szCs w:val="20"/>
-              </w:rPr>
-              <w:t xml:space="preserve">30%</w:t>
-            </w:r>
-          </w:p>
-        </w:tc>
-        <w:tc>
-          <w:tcPr>
-            <w:tcW w:type="dxa" w:w="1800"/>
-            <w:tcMar>
-              <w:top w:type="dxa" w:w="60"/>
-              <w:left w:type="dxa" w:w="100"/>
-              <w:bottom w:type="dxa" w:w="60"/>
-              <w:right w:type="dxa" w:w="100"/>
-            </w:tcMar>
-            <w:vAlign w:val="center"/>
-          </w:tcPr>
-          <w:p>
-            <w:pPr>
-              <w:jc w:val="right"/>
-            </w:pPr>
-            <w:r>
-              <w:rPr>
-                <w:rFonts w:ascii="Calibri" w:cs="Calibri" w:eastAsia="Calibri" w:hAnsi="Calibri"/>
-                <w:b/>
-                <w:bCs/>
-                <w:color w:val="C00000"/>
-              </w:rPr>
-              <w:t xml:space="preserve">[4,500.00]</w:t>
-            </w:r>
-          </w:p>
-        </w:tc>
-        <w:tc>
-          <w:tcPr>
-            <w:tcW w:type="dxa" w:w="1800"/>
-            <w:tcMar>
-              <w:top w:type="dxa" w:w="60"/>
-              <w:left w:type="dxa" w:w="100"/>
-              <w:bottom w:type="dxa" w:w="60"/>
-              <w:right w:type="dxa" w:w="100"/>
-            </w:tcMar>
-            <w:vAlign w:val="center"/>
-          </w:tcPr>
-          <w:p>
-            <w:pPr>
-              <w:jc w:val="right"/>
-            </w:pPr>
-            <w:r>
-              <w:rPr>
-                <w:rFonts w:ascii="Calibri" w:cs="Calibri" w:eastAsia="Calibri" w:hAnsi="Calibri"/>
-                <w:b/>
-                <w:bCs/>
-                <w:color w:val="C00000"/>
-              </w:rPr>
-              <w:t xml:space="preserve">[810.00]</w:t>
-            </w:r>
-          </w:p>
-        </w:tc>
-      </w:tr>
-      <w:tr>
-        <w:tc>
-          <w:tcPr>
-            <w:tcW w:type="dxa" w:w="4260"/>
-            <w:shd w:fill="D9E1F2" w:color="auto" w:val="clear"/>
-            <w:tcMar>
-              <w:top w:type="dxa" w:w="60"/>
-              <w:left w:type="dxa" w:w="100"/>
-              <w:bottom w:type="dxa" w:w="60"/>
-              <w:right w:type="dxa" w:w="100"/>
-            </w:tcMar>
-            <w:vAlign w:val="center"/>
-          </w:tcPr>
-          <w:p>
-            <w:pPr>
-              <w:jc w:val="left"/>
-            </w:pPr>
-            <w:r>
-              <w:rPr>
-                <w:rFonts w:ascii="Calibri" w:cs="Calibri" w:eastAsia="Calibri" w:hAnsi="Calibri"/>
-                <w:b/>
-                <w:bCs/>
-                <w:color w:val="000000"/>
-                <w:sz w:val="20"/>
-                <w:szCs w:val="20"/>
-              </w:rPr>
-              <w:t xml:space="preserve">Subtotal</w:t>
-            </w:r>
-          </w:p>
-        </w:tc>
-        <w:tc>
-          <w:tcPr>
-            <w:tcW w:type="dxa" w:w="1500"/>
-            <w:shd w:fill="D9E1F2" w:color="auto" w:val="clear"/>
-            <w:tcMar>
-              <w:top w:type="dxa" w:w="60"/>
-              <w:left w:type="dxa" w:w="100"/>
-              <w:bottom w:type="dxa" w:w="60"/>
-              <w:right w:type="dxa" w:w="100"/>
-            </w:tcMar>
-            <w:vAlign w:val="center"/>
-          </w:tcPr>
-          <w:p>
-            <w:pPr>
-              <w:jc w:val="center"/>
-            </w:pPr>
-            <w:r>
-              <w:rPr>
-                <w:rFonts w:ascii="Calibri" w:cs="Calibri" w:eastAsia="Calibri" w:hAnsi="Calibri"/>
-                <w:b/>
-                <w:bCs/>
-                <w:color w:val="000000"/>
-                <w:sz w:val="20"/>
-                <w:szCs w:val="20"/>
-              </w:rPr>
-              <w:t xml:space="preserve">100%</w:t>
-            </w:r>
-          </w:p>
-        </w:tc>
-        <w:tc>
-          <w:tcPr>
-            <w:tcW w:type="dxa" w:w="1800"/>
-            <w:shd w:fill="D9E1F2" w:color="auto" w:val="clear"/>
-            <w:tcMar>
-              <w:top w:type="dxa" w:w="60"/>
-              <w:left w:type="dxa" w:w="100"/>
-              <w:bottom w:type="dxa" w:w="60"/>
-              <w:right w:type="dxa" w:w="100"/>
-            </w:tcMar>
-            <w:vAlign w:val="center"/>
-          </w:tcPr>
-          <w:p>
-            <w:pPr>
-              <w:jc w:val="right"/>
-            </w:pPr>
-            <w:r>
-              <w:rPr>
-                <w:rFonts w:ascii="Calibri" w:cs="Calibri" w:eastAsia="Calibri" w:hAnsi="Calibri"/>
-                <w:b/>
-                <w:bCs/>
-                <w:color w:val="C00000"/>
-              </w:rPr>
-              <w:t xml:space="preserve">[15,000.00]</w:t>
-            </w:r>
-          </w:p>
-        </w:tc>
-        <w:tc>
-          <w:tcPr>
-            <w:tcW w:type="dxa" w:w="1800"/>
-            <w:shd w:fill="D9E1F2" w:color="auto" w:val="clear"/>
-            <w:tcMar>
-              <w:top w:type="dxa" w:w="60"/>
-              <w:left w:type="dxa" w:w="100"/>
-              <w:bottom w:type="dxa" w:w="60"/>
-              <w:right w:type="dxa" w:w="100"/>
-            </w:tcMar>
-            <w:vAlign w:val="center"/>
-          </w:tcPr>
-          <w:p>
-            <w:pPr>
-              <w:jc w:val="right"/>
-            </w:pPr>
-            <w:r>
-              <w:rPr>
-                <w:rFonts w:ascii="Calibri" w:cs="Calibri" w:eastAsia="Calibri" w:hAnsi="Calibri"/>
-                <w:b/>
-                <w:bCs/>
-                <w:color w:val="C00000"/>
-              </w:rPr>
-              <w:t xml:space="preserve">[2,700.00]</w:t>
-            </w:r>
-          </w:p>
-        </w:tc>
-      </w:tr>
-      <w:tr>
-        <w:tc>
-          <w:tcPr>
-            <w:tcW w:type="dxa" w:w="4260"/>
-            <w:shd w:fill="1F3864" w:color="auto" w:val="clear"/>
-            <w:tcMar>
-              <w:top w:type="dxa" w:w="60"/>
-              <w:left w:type="dxa" w:w="100"/>
-              <w:bottom w:type="dxa" w:w="60"/>
-              <w:right w:type="dxa" w:w="100"/>
-            </w:tcMar>
-            <w:vAlign w:val="center"/>
-          </w:tcPr>
-          <w:p>
-            <w:pPr>
-              <w:jc w:val="left"/>
             </w:pPr>
             <w:r>
               <w:rPr>
@@ -2442,42 +2131,13 @@
                 <w:sz w:val="20"/>
                 <w:szCs w:val="20"/>
               </w:rPr>
-              <w:t xml:space="preserve">TOTAL A PAGAR (incluye IGV)</w:t>
-            </w:r>
-          </w:p>
-        </w:tc>
-        <w:tc>
-          <w:tcPr>
-            <w:tcW w:type="dxa" w:w="1500"/>
-            <w:shd w:fill="1F3864" w:color="auto" w:val="clear"/>
-            <w:tcMar>
-              <w:top w:type="dxa" w:w="60"/>
-              <w:left w:type="dxa" w:w="100"/>
-              <w:bottom w:type="dxa" w:w="60"/>
-              <w:right w:type="dxa" w:w="100"/>
-            </w:tcMar>
-            <w:vAlign w:val="center"/>
-          </w:tcPr>
-          <w:p>
-            <w:pPr>
-              <w:jc w:val="left"/>
-            </w:pPr>
-            <w:r>
-              <w:rPr>
-                <w:rFonts w:ascii="Calibri" w:cs="Calibri" w:eastAsia="Calibri" w:hAnsi="Calibri"/>
-                <w:b w:val="false"/>
-                <w:bCs w:val="false"/>
-                <w:color w:val="000000"/>
-                <w:sz w:val="20"/>
-                <w:szCs w:val="20"/>
-              </w:rPr>
-              <w:t xml:space="preserve"/>
-            </w:r>
-          </w:p>
-        </w:tc>
-        <w:tc>
-          <w:tcPr>
-            <w:tcW w:type="dxa" w:w="1800"/>
+              <w:t xml:space="preserve">100%</w:t>
+            </w:r>
+          </w:p>
+        </w:tc>
+        <w:tc>
+          <w:tcPr>
+            <w:tcW w:type="dxa" w:w="2600"/>
             <w:shd w:fill="1F3864" w:color="auto" w:val="clear"/>
             <w:tcMar>
               <w:top w:type="dxa" w:w="60"/>
@@ -2498,45 +2158,7 @@
                 <w:bCs/>
                 <w:color w:val="FFFFFF"/>
               </w:rPr>
-              <w:t xml:space="preserve">S/ </w:t>
-            </w:r>
-            <w:r>
-              <w:rPr>
-                <w:rFonts w:ascii="Calibri" w:cs="Calibri" w:eastAsia="Calibri" w:hAnsi="Calibri"/>
-                <w:b/>
-                <w:bCs/>
-                <w:color w:val="FFFFFF"/>
-              </w:rPr>
-              <w:t xml:space="preserve">[17,700.00]</w:t>
-            </w:r>
-          </w:p>
-        </w:tc>
-        <w:tc>
-          <w:tcPr>
-            <w:tcW w:type="dxa" w:w="1800"/>
-            <w:shd w:fill="1F3864" w:color="auto" w:val="clear"/>
-            <w:tcMar>
-              <w:top w:type="dxa" w:w="60"/>
-              <w:left w:type="dxa" w:w="100"/>
-              <w:bottom w:type="dxa" w:w="60"/>
-              <w:right w:type="dxa" w:w="100"/>
-            </w:tcMar>
-            <w:vAlign w:val="center"/>
-          </w:tcPr>
-          <w:p>
-            <w:pPr>
-              <w:jc w:val="left"/>
-            </w:pPr>
-            <w:r>
-              <w:rPr>
-                <w:rFonts w:ascii="Calibri" w:cs="Calibri" w:eastAsia="Calibri" w:hAnsi="Calibri"/>
-                <w:b w:val="false"/>
-                <w:bCs w:val="false"/>
-                <w:color w:val="000000"/>
-                <w:sz w:val="20"/>
-                <w:szCs w:val="20"/>
-              </w:rPr>
-              <w:t xml:space="preserve"/>
+              <w:t xml:space="preserve">S/ 15,000.00</w:t>
             </w:r>
           </w:p>
         </w:tc>
@@ -2558,11 +2180,11 @@
           <w:rFonts w:ascii="Calibri" w:cs="Calibri" w:eastAsia="Calibri" w:hAnsi="Calibri"/>
           <w:b/>
           <w:bCs/>
-          <w:color w:val="C00000"/>
+          <w:color w:val="1F3864"/>
           <w:sz w:val="18"/>
           <w:szCs w:val="18"/>
         </w:rPr>
-        <w:t xml:space="preserve">Nota tributaria (importante): </w:t>
+        <w:t xml:space="preserve">Condición tributaria: </w:t>
       </w:r>
       <w:r>
         <w:rPr>
@@ -2570,40 +2192,13 @@
           <w:sz w:val="18"/>
           <w:szCs w:val="18"/>
         </w:rPr>
-        <w:t xml:space="preserve">el tratamiento del impuesto depende de cómo emita sus comprobantes. </w:t>
-      </w:r>
-      <w:r>
-        <w:rPr>
-          <w:rFonts w:ascii="Calibri" w:cs="Calibri" w:eastAsia="Calibri" w:hAnsi="Calibri"/>
-          <w:sz w:val="18"/>
-          <w:szCs w:val="18"/>
-        </w:rPr>
-        <w:t xml:space="preserve">(a) Si emite Recibo por Honorarios (renta de 4.ª categoría), el servicio NO está afecto a IGV; en su lugar, la empresa podría retener el 8% de renta. </w:t>
-      </w:r>
-      <w:r>
-        <w:rPr>
-          <w:rFonts w:ascii="Calibri" w:cs="Calibri" w:eastAsia="Calibri" w:hAnsi="Calibri"/>
-          <w:sz w:val="18"/>
-          <w:szCs w:val="18"/>
-        </w:rPr>
-        <w:t xml:space="preserve">(b) Si emite Factura (persona natural con negocio / 3.ª categoría), aplica IGV 18%. </w:t>
-      </w:r>
-      <w:r>
-        <w:rPr>
-          <w:rFonts w:ascii="Calibri" w:cs="Calibri" w:eastAsia="Calibri" w:hAnsi="Calibri"/>
-          <w:i/>
-          <w:iCs/>
-          <w:color w:val="808080"/>
-          <w:sz w:val="18"/>
-          <w:szCs w:val="18"/>
-        </w:rPr>
-        <w:t xml:space="preserve">Elimine la columna/línea que no corresponda a su régimen antes de enviar la cotización.</w:t>
+        <w:t xml:space="preserve">el consultor emite Recibo por Honorarios (renta de 4.ª categoría) y cuenta con suspensión de retenciones vigente; por lo tanto, el servicio no está afecto a IGV ni a retención de renta. El importe indicado es el monto neto a transferir.</w:t>
       </w:r>
     </w:p>
     <w:p>
       <w:pPr>
         <w:pStyle w:val="Heading1"/>
-        <w:spacing w:after="100" w:before="220"/>
+        <w:spacing w:after="100" w:before="240"/>
       </w:pPr>
       <w:r>
         <w:rPr>
@@ -2636,15 +2231,14 @@
           <w:rFonts w:ascii="Calibri" w:cs="Calibri" w:eastAsia="Calibri" w:hAnsi="Calibri"/>
           <w:b/>
           <w:bCs/>
-          <w:color w:val="C00000"/>
-        </w:rPr>
-        <w:t xml:space="preserve">[transferencia / depósito]</w:t>
-      </w:r>
-      <w:r>
-        <w:rPr>
-          <w:rFonts w:ascii="Calibri" w:cs="Calibri" w:eastAsia="Calibri" w:hAnsi="Calibri"/>
-        </w:rPr>
-        <w:t xml:space="preserve"> a la cuenta que se indicará en cada comprobante.</w:t>
+        </w:rPr>
+        <w:t xml:space="preserve">transferencia bancaria</w:t>
+      </w:r>
+      <w:r>
+        <w:rPr>
+          <w:rFonts w:ascii="Calibri" w:cs="Calibri" w:eastAsia="Calibri" w:hAnsi="Calibri"/>
+        </w:rPr>
+        <w:t xml:space="preserve"> a la cuenta que se indicará en cada Recibo por Honorarios.</w:t>
       </w:r>
     </w:p>
     <w:p>
@@ -2661,7 +2255,7 @@
         <w:rPr>
           <w:rFonts w:ascii="Calibri" w:cs="Calibri" w:eastAsia="Calibri" w:hAnsi="Calibri"/>
         </w:rPr>
-        <w:t xml:space="preserve">Cada hito se factura contra su cumplimiento; la entrega final se realiza una vez cancelado el saldo pendiente.</w:t>
+        <w:t xml:space="preserve">Cada hito se cobra contra su cumplimiento; la entrega final se realiza una vez cancelado el saldo pendiente.</w:t>
       </w:r>
     </w:p>
     <w:p>
@@ -2678,28 +2272,13 @@
         <w:rPr>
           <w:rFonts w:ascii="Calibri" w:cs="Calibri" w:eastAsia="Calibri" w:hAnsi="Calibri"/>
         </w:rPr>
-        <w:t xml:space="preserve">Plazo de pago: </w:t>
-      </w:r>
-      <w:r>
-        <w:rPr>
-          <w:rFonts w:ascii="Calibri" w:cs="Calibri" w:eastAsia="Calibri" w:hAnsi="Calibri"/>
-          <w:b/>
-          <w:bCs/>
-          <w:color w:val="C00000"/>
-        </w:rPr>
-        <w:t xml:space="preserve">[a la presentación del comprobante / a X días]</w:t>
-      </w:r>
-      <w:r>
-        <w:rPr>
-          <w:rFonts w:ascii="Calibri" w:cs="Calibri" w:eastAsia="Calibri" w:hAnsi="Calibri"/>
-        </w:rPr>
-        <w:t xml:space="preserve">.</w:t>
+        <w:t xml:space="preserve">Plazo de pago: a la presentación del comprobante.</w:t>
       </w:r>
     </w:p>
     <w:p>
       <w:pPr>
         <w:pStyle w:val="Heading1"/>
-        <w:spacing w:after="100" w:before="220"/>
+        <w:spacing w:after="100" w:before="240"/>
       </w:pPr>
       <w:r>
         <w:rPr>
@@ -2742,7 +2321,7 @@
         <w:rPr>
           <w:rFonts w:ascii="Calibri" w:cs="Calibri" w:eastAsia="Calibri" w:hAnsi="Calibri"/>
         </w:rPr>
-        <w:t xml:space="preserve">El modelo financiero constituye una proyección basada en supuestos; no garantiza la aprobación del financiamiento, la cual es potestad exclusiva del banco.</w:t>
+        <w:t xml:space="preserve">El modelo financiero constituye una proyección basada en supuestos; no garantiza la emisión de la carta fianza, la cual es potestad exclusiva de la aseguradora.</w:t>
       </w:r>
     </w:p>
     <w:p>
@@ -2776,28 +2355,13 @@
         <w:rPr>
           <w:rFonts w:ascii="Calibri" w:cs="Calibri" w:eastAsia="Calibri" w:hAnsi="Calibri"/>
         </w:rPr>
-        <w:t xml:space="preserve">Se incluye </w:t>
-      </w:r>
-      <w:r>
-        <w:rPr>
-          <w:rFonts w:ascii="Calibri" w:cs="Calibri" w:eastAsia="Calibri" w:hAnsi="Calibri"/>
-          <w:b/>
-          <w:bCs/>
-          <w:color w:val="C00000"/>
-        </w:rPr>
-        <w:t xml:space="preserve">[una (1)]</w:t>
-      </w:r>
-      <w:r>
-        <w:rPr>
-          <w:rFonts w:ascii="Calibri" w:cs="Calibri" w:eastAsia="Calibri" w:hAnsi="Calibri"/>
-        </w:rPr>
-        <w:t xml:space="preserve"> ronda de ajustes sobre el borrador. Rondas o alcances adicionales se cotizan por separado.</w:t>
+        <w:t xml:space="preserve">Se incluye una (1) ronda de ajustes sobre el borrador. Rondas o alcances adicionales se cotizan por separado.</w:t>
       </w:r>
     </w:p>
     <w:p>
       <w:pPr>
         <w:pStyle w:val="Heading1"/>
-        <w:spacing w:after="100" w:before="220"/>
+        <w:spacing w:after="100" w:before="240"/>
       </w:pPr>
       <w:r>
         <w:rPr>
@@ -2823,7 +2387,7 @@
         <w:rPr>
           <w:rFonts w:ascii="Calibri" w:cs="Calibri" w:eastAsia="Calibri" w:hAnsi="Calibri"/>
         </w:rPr>
-        <w:t xml:space="preserve">Elaboración de expedientes técnicos, tasaciones, estudios de mercado o valorizaciones de obra ejecutadas en campo.</w:t>
+        <w:t xml:space="preserve">Elaboración de expedientes técnicos, tasaciones, estudios de mercado o el registro del proyecto ante el Fondo MIVIVIENDA / Techo Propio.</w:t>
       </w:r>
     </w:p>
     <w:p>
@@ -2840,13 +2404,13 @@
         <w:rPr>
           <w:rFonts w:ascii="Calibri" w:cs="Calibri" w:eastAsia="Calibri" w:hAnsi="Calibri"/>
         </w:rPr>
-        <w:t xml:space="preserve">Gestión o trámite directo ante la entidad bancaria y gastos notariales, registrales o de tasación que el banco requiera.</w:t>
+        <w:t xml:space="preserve">Gestión o trámite directo ante la aseguradora, y los costos de emisión y comisión de la carta fianza.</w:t>
       </w:r>
     </w:p>
     <w:p>
       <w:pPr>
         <w:pStyle w:val="Heading1"/>
-        <w:spacing w:after="100" w:before="220"/>
+        <w:spacing w:after="100" w:before="240"/>
       </w:pPr>
       <w:r>
         <w:rPr>
@@ -2874,15 +2438,14 @@
           <w:rFonts w:ascii="Calibri" w:cs="Calibri" w:eastAsia="Calibri" w:hAnsi="Calibri"/>
           <w:b/>
           <w:bCs/>
-          <w:color w:val="C00000"/>
-        </w:rPr>
-        <w:t xml:space="preserve">[15]</w:t>
-      </w:r>
-      <w:r>
-        <w:rPr>
-          <w:rFonts w:ascii="Calibri" w:cs="Calibri" w:eastAsia="Calibri" w:hAnsi="Calibri"/>
-        </w:rPr>
-        <w:t xml:space="preserve"> días calendario a partir de su fecha de emisión.</w:t>
+        </w:rPr>
+        <w:t xml:space="preserve">15 días calendario</w:t>
+      </w:r>
+      <w:r>
+        <w:rPr>
+          <w:rFonts w:ascii="Calibri" w:cs="Calibri" w:eastAsia="Calibri" w:hAnsi="Calibri"/>
+        </w:rPr>
+        <w:t xml:space="preserve"> a partir de su fecha de emisión.</w:t>
       </w:r>
     </w:p>
     <w:p>
@@ -2893,7 +2456,7 @@
     <w:p>
       <w:pPr>
         <w:pStyle w:val="Heading1"/>
-        <w:spacing w:after="100" w:before="220"/>
+        <w:spacing w:after="100" w:before="240"/>
       </w:pPr>
       <w:r>
         <w:rPr>
@@ -3038,9 +2601,8 @@
                 <w:rFonts w:ascii="Calibri" w:cs="Calibri" w:eastAsia="Calibri" w:hAnsi="Calibri"/>
                 <w:b/>
                 <w:bCs/>
-                <w:color w:val="C00000"/>
-              </w:rPr>
-              <w:t xml:space="preserve">[TU NOMBRE COMPLETO]</w:t>
+              </w:rPr>
+              <w:t xml:space="preserve">ENRIQUE HUIDOBRO</w:t>
             </w:r>
           </w:p>
         </w:tc>
@@ -3064,9 +2626,8 @@
                 <w:rFonts w:ascii="Calibri" w:cs="Calibri" w:eastAsia="Calibri" w:hAnsi="Calibri"/>
                 <w:b/>
                 <w:bCs/>
-                <w:color w:val="C00000"/>
-              </w:rPr>
-              <w:t xml:space="preserve">[REPRESENTANTE DE LA EMPRESA]</w:t>
+              </w:rPr>
+              <w:t xml:space="preserve">José Antonio Navarro Merea</w:t>
             </w:r>
           </w:p>
         </w:tc>
@@ -3091,10 +2652,10 @@
               <w:rPr>
                 <w:rFonts w:ascii="Calibri" w:cs="Calibri" w:eastAsia="Calibri" w:hAnsi="Calibri"/>
                 <w:color w:val="808080"/>
-                <w:sz w:val="18"/>
-                <w:szCs w:val="18"/>
-              </w:rPr>
-              <w:t xml:space="preserve">El Consultor</w:t>
+                <w:sz w:val="16"/>
+                <w:szCs w:val="16"/>
+              </w:rPr>
+              <w:t xml:space="preserve">Economista · RUC 10723712039 · El Consultor</w:t>
             </w:r>
           </w:p>
         </w:tc>
@@ -3117,10 +2678,10 @@
               <w:rPr>
                 <w:rFonts w:ascii="Calibri" w:cs="Calibri" w:eastAsia="Calibri" w:hAnsi="Calibri"/>
                 <w:color w:val="808080"/>
-                <w:sz w:val="18"/>
-                <w:szCs w:val="18"/>
-              </w:rPr>
-              <w:t xml:space="preserve">La Empresa</w:t>
+                <w:sz w:val="16"/>
+                <w:szCs w:val="16"/>
+              </w:rPr>
+              <w:t xml:space="preserve">Gerente General · Inversiones Estratégicas Integrales S.A.C.</w:t>
             </w:r>
           </w:p>
         </w:tc>
@@ -3194,25 +2755,7 @@
         <w:sz w:val="16"/>
         <w:szCs w:val="16"/>
       </w:rPr>
-      <w:t xml:space="preserve">Cotización de servicios profesionales   ·   </w:t>
-    </w:r>
-    <w:r>
-      <w:rPr>
-        <w:rFonts w:ascii="Calibri" w:cs="Calibri" w:eastAsia="Calibri" w:hAnsi="Calibri"/>
-        <w:b/>
-        <w:bCs/>
-        <w:color w:val="C00000"/>
-      </w:rPr>
-      <w:t xml:space="preserve">[Tu nombre]</w:t>
-    </w:r>
-    <w:r>
-      <w:rPr>
-        <w:rFonts w:ascii="Calibri" w:cs="Calibri" w:eastAsia="Calibri" w:hAnsi="Calibri"/>
-        <w:color w:val="808080"/>
-        <w:sz w:val="16"/>
-        <w:szCs w:val="16"/>
-      </w:rPr>
-      <w:t xml:space="preserve">   ·   Página </w:t>
+      <w:t xml:space="preserve">Cotización COT-2026-001   ·   Enrique Huidobro   ·   Villa El Milagro</w:t>
     </w:r>
   </w:p>
 </w:ftr>

</xml_diff>

<commit_message>
Cerrar cotización: RUC empresa, honorario S/ 10,000 y datos reales de obra
- RUC de Inversiones Estratégicas Integrales S.A.C.: 20503680174.
- Honorario dimensionado sobre la obra real: S/ 10,000 (20/30/50 =
  2,000/3,000/5,000). Cotización sin campos pendientes.
- Modelo: área techada 3,009.395 m² y costo total de obra
  S/ 3,998,621.74 como inputs; costo por m² pasa a derivarse.

Co-Authored-By: Claude Opus 4.8 <noreply@anthropic.com>
Claude-Session: https://claude.ai/code/session_01SCxhLGdtCgXmghQV6pgZo9
</commit_message>
<xml_diff>
--- a/entregables/Cotizacion_Servicios_Profesionales.docx
+++ b/entregables/Cotizacion_Servicios_Profesionales.docx
@@ -228,11 +228,13 @@
             <w:r>
               <w:rPr>
                 <w:rFonts w:ascii="Calibri" w:cs="Calibri" w:eastAsia="Calibri" w:hAnsi="Calibri"/>
-                <w:b/>
-                <w:bCs/>
-                <w:color w:val="C00000"/>
-              </w:rPr>
-              <w:t xml:space="preserve">[N° RUC de la empresa]</w:t>
+                <w:b w:val="false"/>
+                <w:bCs w:val="false"/>
+                <w:color w:val="000000"/>
+                <w:sz w:val="20"/>
+                <w:szCs w:val="20"/>
+              </w:rPr>
+              <w:t xml:space="preserve">20503680174</w:t>
             </w:r>
           </w:p>
         </w:tc>
@@ -1686,13 +1688,13 @@
           <w:b/>
           <w:bCs/>
         </w:rPr>
-        <w:t xml:space="preserve">S/ 15,000.00</w:t>
-      </w:r>
-      <w:r>
-        <w:rPr>
-          <w:rFonts w:ascii="Calibri" w:cs="Calibri" w:eastAsia="Calibri" w:hAnsi="Calibri"/>
-        </w:rPr>
-        <w:t xml:space="preserve"> (quince mil y 00/100 soles), pagaderos </w:t>
+        <w:t xml:space="preserve">S/ 10,000.00</w:t>
+      </w:r>
+      <w:r>
+        <w:rPr>
+          <w:rFonts w:ascii="Calibri" w:cs="Calibri" w:eastAsia="Calibri" w:hAnsi="Calibri"/>
+        </w:rPr>
+        <w:t xml:space="preserve"> (diez mil y 00/100 soles), pagaderos </w:t>
       </w:r>
       <w:r>
         <w:rPr>
@@ -1899,7 +1901,7 @@
                 <w:sz w:val="20"/>
                 <w:szCs w:val="20"/>
               </w:rPr>
-              <w:t xml:space="preserve">3,000.00</w:t>
+              <w:t xml:space="preserve">2,000.00</w:t>
             </w:r>
           </w:p>
         </w:tc>
@@ -1985,7 +1987,7 @@
                 <w:sz w:val="20"/>
                 <w:szCs w:val="20"/>
               </w:rPr>
-              <w:t xml:space="preserve">4,500.00</w:t>
+              <w:t xml:space="preserve">3,000.00</w:t>
             </w:r>
           </w:p>
         </w:tc>
@@ -2071,7 +2073,7 @@
                 <w:sz w:val="20"/>
                 <w:szCs w:val="20"/>
               </w:rPr>
-              <w:t xml:space="preserve">7,500.00</w:t>
+              <w:t xml:space="preserve">5,000.00</w:t>
             </w:r>
           </w:p>
         </w:tc>
@@ -2158,7 +2160,7 @@
                 <w:bCs/>
                 <w:color w:val="FFFFFF"/>
               </w:rPr>
-              <w:t xml:space="preserve">S/ 15,000.00</w:t>
+              <w:t xml:space="preserve">S/ 10,000.00</w:t>
             </w:r>
           </w:p>
         </w:tc>

</xml_diff>

<commit_message>
Actualizar plazo de entrega a 21 días calendario
Cronograma redistribuido: 3 (levantamiento) + 13 (construcción del
modelo y borrador) + 5 (revisión y entrega final) = 21 días.

Co-Authored-By: Claude Opus 4.8 <noreply@anthropic.com>
Claude-Session: https://claude.ai/code/session_01SCxhLGdtCgXmghQV6pgZo9
</commit_message>
<xml_diff>
--- a/entregables/Cotizacion_Servicios_Profesionales.docx
+++ b/entregables/Cotizacion_Servicios_Profesionales.docx
@@ -1381,7 +1381,7 @@
           <w:b/>
           <w:bCs/>
         </w:rPr>
-        <w:t xml:space="preserve">15 días calendario</w:t>
+        <w:t xml:space="preserve">21 días calendario</w:t>
       </w:r>
       <w:r>
         <w:rPr>
@@ -1580,7 +1580,7 @@
                 <w:sz w:val="20"/>
                 <w:szCs w:val="20"/>
               </w:rPr>
-              <w:t xml:space="preserve">10 días</w:t>
+              <w:t xml:space="preserve">13 días</w:t>
             </w:r>
           </w:p>
         </w:tc>

</xml_diff>